<commit_message>
feat(ai): Add Gemini 3.8 and frontier reasoning dialect awareness, thought-folding, grounding citation synthesis, and output styling
</commit_message>
<xml_diff>
--- a/examples/gauntlet.docx
+++ b/examples/gauntlet.docx
@@ -4250,8 +4250,8 @@
       </w:hyperlink>
     </w:p>
     <w:sectPr>
-      <w:headerReference xmlns:r="http://schemas.openxmlformats.org/officeDocument/2006/relationships" w:type="default" r:id="R27ed4dd7f71d4d72"/>
-      <w:footerReference xmlns:r="http://schemas.openxmlformats.org/officeDocument/2006/relationships" w:type="default" r:id="R6b1446f55e934e79"/>
+      <w:headerReference xmlns:r="http://schemas.openxmlformats.org/officeDocument/2006/relationships" w:type="default" r:id="Rde48b59bd87745dc"/>
+      <w:footerReference xmlns:r="http://schemas.openxmlformats.org/officeDocument/2006/relationships" w:type="default" r:id="R1a9f8fae410b41a2"/>
       <w:pgSz w:w="11906" w:h="16838"/>
       <w:pgMar w:top="1440" w:right="1440" w:bottom="1440" w:left="1440" w:header="576" w:footer="576" w:gutter="0"/>
     </w:sectPr>
@@ -4683,7 +4683,7 @@
 </file>
 
 <file path=customXml/item.xml><?xml version="1.0" encoding="utf-8"?>
-<marksmithSource schema="marksmith-source-v1" version="3.1.0.0" exportedUtc="2026-09-02T10:08:40.7789787Z" theme="GitHub Light" mermaidMode="1">
+<marksmithSource schema="marksmith-source-v1" version="3.1.0.0" exportedUtc="2026-09-02T20:41:57.1543783Z" theme="GitHub Light" mermaidMode="1">
   <markdown><![CDATA[---
 title: The MarkSmith OpenXML Gauntlet
 ---

</xml_diff>

<commit_message>
feat(docx): Polish table margins with TableCellMarginDefault, callout spacing, NoEmoji text badges, and References heading normalization
</commit_message>
<xml_diff>
--- a/examples/gauntlet.docx
+++ b/examples/gauntlet.docx
@@ -1,6 +1,6 @@
 
 <file path=word/document.xml><?xml version="1.0" encoding="utf-8"?>
-<w:document xmlns:wp="http://schemas.openxmlformats.org/drawingml/2006/wordprocessingDrawing" xmlns:a="http://schemas.openxmlformats.org/drawingml/2006/main" xmlns:wpg="http://schemas.microsoft.com/office/word/2010/wordprocessingGroup" xmlns:wps="http://schemas.microsoft.com/office/word/2010/wordprocessingShape" xmlns:w="http://schemas.openxmlformats.org/wordprocessingml/2006/main" xmlns:w14="http://schemas.microsoft.com/office/word/2010/wordml" xmlns:w15="http://schemas.microsoft.com/office/word/2012/wordml" xmlns:mc="http://schemas.openxmlformats.org/markup-compatibility/2006" mc:Ignorable="w14 w15">
+<w:document xmlns:w="http://schemas.openxmlformats.org/wordprocessingml/2006/main" xmlns:r="http://schemas.openxmlformats.org/officeDocument/2006/relationships" xmlns:m="http://schemas.openxmlformats.org/officeDocument/2006/math" xmlns:w14="http://schemas.microsoft.com/office/word/2010/wordml" xmlns:w15="http://schemas.microsoft.com/office/word/2012/wordml" xmlns:a="http://schemas.openxmlformats.org/drawingml/2006/main" xmlns:wp="http://schemas.openxmlformats.org/drawingml/2006/wordprocessingDrawing" xmlns:pic="http://schemas.openxmlformats.org/drawingml/2006/picture" xmlns:c="http://schemas.openxmlformats.org/drawingml/2006/chart" xmlns:dgm="http://schemas.openxmlformats.org/drawingml/2006/diagram" xmlns:wpg="http://schemas.microsoft.com/office/word/2010/wordprocessingGroup" xmlns:wps="http://schemas.microsoft.com/office/word/2010/wordprocessingShape" xmlns:mc="http://schemas.openxmlformats.org/markup-compatibility/2006" mc:Ignorable="w14 w15">
   <w:background w:color="FFFFFF"/>
   <w:body>
     <w:p>
@@ -120,7 +120,7 @@
         <w:spacing w:before="120" w:after="120"/>
         <w:jc w:val="center"/>
       </w:pPr>
-      <m:oMath xmlns:m="http://schemas.openxmlformats.org/officeDocument/2006/math">
+      <m:oMath>
         <m:r>
           <m:t xml:space="preserve">i</m:t>
         </m:r>
@@ -206,7 +206,7 @@
         </w:rPr>
         <w:t xml:space="preserve">Where the Hamiltonian matrix </w:t>
       </w:r>
-      <m:oMath xmlns:m="http://schemas.openxmlformats.org/officeDocument/2006/math">
+      <m:oMath>
         <m:r>
           <m:t xml:space="preserve">Ĥ</m:t>
         </m:r>
@@ -230,7 +230,7 @@
         <w:spacing w:before="120" w:after="120"/>
         <w:jc w:val="center"/>
       </w:pPr>
-      <m:oMath xmlns:m="http://schemas.openxmlformats.org/officeDocument/2006/math">
+      <m:oMath>
         <m:r>
           <m:t xml:space="preserve">Ĥ</m:t>
         </m:r>
@@ -551,7 +551,7 @@
         <w:spacing w:before="120" w:after="120"/>
         <w:jc w:val="center"/>
       </w:pPr>
-      <m:oMath xmlns:m="http://schemas.openxmlformats.org/officeDocument/2006/math">
+      <m:oMath>
         <m:r>
           <m:t xml:space="preserve">Z</m:t>
         </m:r>
@@ -788,7 +788,7 @@
         <w:spacing w:before="120" w:after="120"/>
         <w:jc w:val="center"/>
       </w:pPr>
-      <m:oMath xmlns:m="http://schemas.openxmlformats.org/officeDocument/2006/math">
+      <m:oMath>
         <m:r>
           <m:t xml:space="preserve">\ce</m:t>
         </m:r>
@@ -886,7 +886,7 @@
         <w:spacing w:before="120" w:after="120"/>
         <w:jc w:val="center"/>
       </w:pPr>
-      <m:oMath xmlns:m="http://schemas.openxmlformats.org/officeDocument/2006/math">
+      <m:oMath>
         <m:r>
           <m:t xml:space="preserve">\ce</m:t>
         </m:r>
@@ -1780,6 +1780,12 @@
           <w:insideH w:val="single" w:color="D1D5DA" w:sz="6"/>
           <w:insideV w:val="single" w:color="D1D5DA" w:sz="6"/>
         </w:tblBorders>
+        <w:tblCellMar>
+          <w:top w:w="120" w:type="dxa"/>
+          <w:bottom w:w="120" w:type="dxa"/>
+          <w:left w:w="180" w:type="dxa"/>
+          <w:right w:w="180" w:type="dxa"/>
+        </w:tblCellMar>
       </w:tblPr>
       <w:tblGrid>
         <w:gridCol/>
@@ -1913,7 +1919,7 @@
               </w:rPr>
               <w:t xml:space="preserve">Inline math renders in the cell: </w:t>
             </w:r>
-            <m:oMath xmlns:m="http://schemas.openxmlformats.org/officeDocument/2006/math">
+            <m:oMath>
               <m:nary>
                 <m:naryPr>
                   <m:chr m:val="∑"/>
@@ -2192,10 +2198,10 @@
                   <w:tcW w:w="5000" w:type="pct"/>
                   <w:shd w:val="clear" w:color="auto" w:fill="F5ECD6"/>
                   <w:tcMar>
-                    <w:top w:w="100" w:type="dxa"/>
-                    <w:left w:w="160" w:type="dxa"/>
-                    <w:bottom w:w="100" w:type="dxa"/>
-                    <w:right w:w="160" w:type="dxa"/>
+                    <w:top w:w="160" w:type="dxa"/>
+                    <w:left w:w="240" w:type="dxa"/>
+                    <w:bottom w:w="160" w:type="dxa"/>
+                    <w:right w:w="240" w:type="dxa"/>
                   </w:tcMar>
                 </w:tcPr>
                 <w:p>
@@ -2316,10 +2322,10 @@
                   <w:tcW w:w="5000" w:type="pct"/>
                   <w:shd w:val="clear" w:color="auto" w:fill="DBECE0"/>
                   <w:tcMar>
-                    <w:top w:w="100" w:type="dxa"/>
-                    <w:left w:w="160" w:type="dxa"/>
-                    <w:bottom w:w="100" w:type="dxa"/>
-                    <w:right w:w="160" w:type="dxa"/>
+                    <w:top w:w="160" w:type="dxa"/>
+                    <w:left w:w="240" w:type="dxa"/>
+                    <w:bottom w:w="160" w:type="dxa"/>
+                    <w:right w:w="240" w:type="dxa"/>
                   </w:tcMar>
                 </w:tcPr>
                 <w:p>
@@ -4030,21 +4036,7 @@
               </mc:Choice>
             </mc:AlternateContent>
           </w:rPr>
-          <w:t xml:space="preserve"> </w:t>
-        </w:r>
-        <w:r>
-          <w:rPr>
-            <w:rFonts w:ascii="Segoe UI Emoji" w:hAnsi="Segoe UI Emoji" w:eastAsia="Segoe UI Emoji" w:cs="Segoe UI Emoji"/>
-            <mc:AlternateContent>
-              <mc:Choice Requires="w14">
-                <w14:ligatures w14:val="standardContextual"/>
-                <w14:numForm w14:val="oldStyle"/>
-                <w14:numSpacing w14:val="proportional"/>
-                <w14:cntxtAlts/>
-              </mc:Choice>
-            </mc:AlternateContent>
-          </w:rPr>
-          <w:t xml:space="preserve">↩</w:t>
+          <w:t xml:space="preserve"> ↩</w:t>
         </w:r>
       </w:hyperlink>
     </w:p>
@@ -4231,27 +4223,13 @@
               </mc:Choice>
             </mc:AlternateContent>
           </w:rPr>
-          <w:t xml:space="preserve"> </w:t>
-        </w:r>
-        <w:r>
-          <w:rPr>
-            <w:rFonts w:ascii="Segoe UI Emoji" w:hAnsi="Segoe UI Emoji" w:eastAsia="Segoe UI Emoji" w:cs="Segoe UI Emoji"/>
-            <mc:AlternateContent>
-              <mc:Choice Requires="w14">
-                <w14:ligatures w14:val="standardContextual"/>
-                <w14:numForm w14:val="oldStyle"/>
-                <w14:numSpacing w14:val="proportional"/>
-                <w14:cntxtAlts/>
-              </mc:Choice>
-            </mc:AlternateContent>
-          </w:rPr>
-          <w:t xml:space="preserve">↩</w:t>
+          <w:t xml:space="preserve"> ↩</w:t>
         </w:r>
       </w:hyperlink>
     </w:p>
     <w:sectPr>
-      <w:headerReference xmlns:r="http://schemas.openxmlformats.org/officeDocument/2006/relationships" w:type="default" r:id="Rde48b59bd87745dc"/>
-      <w:footerReference xmlns:r="http://schemas.openxmlformats.org/officeDocument/2006/relationships" w:type="default" r:id="R1a9f8fae410b41a2"/>
+      <w:headerReference w:type="default" r:id="Rc6357a7725e74ecd"/>
+      <w:footerReference w:type="default" r:id="R4143762ba6724f4e"/>
       <w:pgSz w:w="11906" w:h="16838"/>
       <w:pgMar w:top="1440" w:right="1440" w:bottom="1440" w:left="1440" w:header="576" w:footer="576" w:gutter="0"/>
     </w:sectPr>
@@ -4683,7 +4661,7 @@
 </file>
 
 <file path=customXml/item.xml><?xml version="1.0" encoding="utf-8"?>
-<marksmithSource schema="marksmith-source-v1" version="3.1.0.0" exportedUtc="2026-09-02T20:41:57.1543783Z" theme="GitHub Light" mermaidMode="1">
+<marksmithSource schema="marksmith-source-v1" version="3.1.0.0" exportedUtc="2026-09-03T02:16:04.0280280Z" theme="GitHub Light" mermaidMode="1">
   <markdown><![CDATA[---
 title: The MarkSmith OpenXML Gauntlet
 ---

</xml_diff>